<commit_message>
Specify fixed initial capital of INR 50,000 per partner
Each Partner contributes INR 50,000 (total firm capital INR 1,00,000)
as recorded on the Commencement Date.

Co-authored-by: shrikant2891-coder <shrikant2891-coder@users.noreply.github.com>
</commit_message>
<xml_diff>
--- a/VAGIAI_Partnership_Deed.docx
+++ b/VAGIAI_Partnership_Deed.docx
@@ -394,10 +394,15 @@
         <w:ind w:left="0"/>
       </w:pPr>
       <w:r>
-        <w:rPr>
-          <w:sz w:val="22"/>
-        </w:rPr>
-        <w:t>6.1 The initial capital of the Firm shall be contributed by the Partners in equal proportion, unless otherwise agreed in writing. The initial capital contribution of each Partner shall be recorded in the books of account of the Firm on the Commencement Date.</w:t>
+        <w:t>6.1 The initial capital of the Firm shall be INR 1,00,000 (Indian Rupees One Lakh Only), contributed equally by the Partners as follows:</w:t>
+        <w:br/>
+        <w:br/>
+        <w:t xml:space="preserve">    • First Party (Mrs. Ranjita Shukla): INR 50,000 (Indian Rupees Fifty Thousand Only)</w:t>
+        <w:br/>
+        <w:t xml:space="preserve">    • Second Party (Mrs. Anjita): INR 50,000 (Indian Rupees Fifty Thousand Only)</w:t>
+        <w:br/>
+        <w:br/>
+        <w:t>The initial capital contribution of each Partner shall be paid in cash and recorded in the books of account of the Firm on the Commencement Date.</w:t>
       </w:r>
     </w:p>
     <w:p>

</xml_diff>